<commit_message>
add pwd to private.zip
</commit_message>
<xml_diff>
--- a/role_play_rcg/support_role_play_fr.docx
+++ b/role_play_rcg/support_role_play_fr.docx
@@ -99,15 +99,7 @@
         <w:jc w:val="both"/>
       </w:pPr>
       <w:r>
-        <w:t xml:space="preserve">Il est à </w:t>
-      </w:r>
-      <w:proofErr w:type="spellStart"/>
-      <w:r>
-        <w:t>noté</w:t>
-      </w:r>
-      <w:proofErr w:type="spellEnd"/>
-      <w:r>
-        <w:t xml:space="preserve"> que pour simplifier les échanges, nous oublierons tous les critères en lien avec le volet technique des bases de données (par exemple la pertinence d’un modèle de données par rapport à un autre). </w:t>
+        <w:t xml:space="preserve">Il est à noté que pour simplifier les échanges, nous oublierons tous les critères en lien avec le volet technique des bases de données (par exemple la pertinence d’un modèle de données par rapport à un autre). </w:t>
       </w:r>
     </w:p>
     <w:p>
@@ -142,21 +134,8 @@
       <w:r>
         <w:t>Le RDBES : « </w:t>
       </w:r>
-      <w:proofErr w:type="spellStart"/>
-      <w:r>
-        <w:t>Regional</w:t>
-      </w:r>
-      <w:proofErr w:type="spellEnd"/>
-      <w:r>
-        <w:t xml:space="preserve"> </w:t>
-      </w:r>
-      <w:proofErr w:type="spellStart"/>
-      <w:r>
-        <w:t>Database</w:t>
-      </w:r>
-      <w:proofErr w:type="spellEnd"/>
-      <w:r>
-        <w:t xml:space="preserve"> &amp; Estimation System</w:t>
+      <w:r>
+        <w:t>Regional Database &amp; Estimation System</w:t>
       </w:r>
       <w:r>
         <w:t> »</w:t>
@@ -262,21 +241,7 @@
           <w:lang w:val="en-US"/>
         </w:rPr>
         <w:lastRenderedPageBreak/>
-        <w:t xml:space="preserve">Le </w:t>
-      </w:r>
-      <w:proofErr w:type="gramStart"/>
-      <w:r>
-        <w:rPr>
-          <w:lang w:val="en-US"/>
-        </w:rPr>
-        <w:t>RDBFIS :</w:t>
-      </w:r>
-      <w:proofErr w:type="gramEnd"/>
-      <w:r>
-        <w:rPr>
-          <w:lang w:val="en-US"/>
-        </w:rPr>
-        <w:t xml:space="preserve"> « regional database for the Mediterranean and Black Seas »</w:t>
+        <w:t>Le RDBFIS : « regional database for the Mediterranean and Black Seas »</w:t>
       </w:r>
     </w:p>
     <w:p>
@@ -326,14 +291,6 @@
       </w:pPr>
       <w:r>
         <w:t xml:space="preserve">Le développement d’un nouveau système de base de données depuis le début est aussi une solution. Cependant, vouloir partir sur ce type de processus doit être bien réfléchis et les conséquences associés prise en considération. Outre les bénéfices de pouvoir modeler un système s’accordant de manière parfaite à nos besoins (et encore on peut se poser la question si un système existant modifié ne pourrais pas faire la même chose), il faut réfléchir en termes de charge de travail, développement, financement et ressources humaines associés. </w:t>
-      </w:r>
-    </w:p>
-    <w:p>
-      <w:pPr>
-        <w:jc w:val="both"/>
-      </w:pPr>
-      <w:r>
-        <w:t>Sans gâcher la surprise de la fin et même si vos discussions peuvent se tourner vers cette solution, sachez que le fait de ne pas recommencer à développer une nouvelle base de données a été accepté à l’unanimité par tous les membres du RCG LP.</w:t>
       </w:r>
     </w:p>
     <w:p>

</xml_diff>